<commit_message>
gai dialogue quest knight fin
</commit_message>
<xml_diff>
--- a/GAI Dialogue.docx
+++ b/GAI Dialogue.docx
@@ -37,8 +37,6 @@
     <w:p>
       <w:r>
         <w:tab/>
-      </w:r>
-      <w:r>
         <w:t>P – Why are there so little people?</w:t>
       </w:r>
     </w:p>
@@ -243,10 +241,7 @@
       </w:pPr>
       <w:r>
         <w:tab/>
-        <w:t xml:space="preserve">P - </w:t>
-      </w:r>
-      <w:r>
-        <w:t>I still haven’t said I’m accepting it yet.</w:t>
+        <w:t>P - I still haven’t said I’m accepting it yet.</w:t>
       </w:r>
     </w:p>
     <w:p>
@@ -304,7 +299,15 @@
         <w:t xml:space="preserve"> </w:t>
       </w:r>
       <w:r>
-        <w:t>you will find a lone cottage. An old woman lives there, or did the last time the hours behaved themselves.</w:t>
+        <w:t xml:space="preserve">you will find a lone cottage. An old woman lives </w:t>
+      </w:r>
+      <w:proofErr w:type="gramStart"/>
+      <w:r>
+        <w:t>there, or</w:t>
+      </w:r>
+      <w:proofErr w:type="gramEnd"/>
+      <w:r>
+        <w:t xml:space="preserve"> did the last time the hours behaved themselves.</w:t>
       </w:r>
       <w:r>
         <w:br/>
@@ -426,8 +429,13 @@
         <w:t xml:space="preserve">P - </w:t>
       </w:r>
       <w:r>
-        <w:t>You got a lot of scars on your back by chance?</w:t>
-      </w:r>
+        <w:t xml:space="preserve">You got a lot of scars on your back by </w:t>
+      </w:r>
+      <w:proofErr w:type="gramStart"/>
+      <w:r>
+        <w:t>chance?</w:t>
+      </w:r>
+      <w:proofErr w:type="gramEnd"/>
     </w:p>
     <w:p>
       <w:pPr>
@@ -526,7 +534,15 @@
         <w:t xml:space="preserve"> </w:t>
       </w:r>
       <w:r>
-        <w:t>you will find a lone cottage. An old woman lives there, or did the last time the hours behaved themselves.</w:t>
+        <w:t xml:space="preserve">you will find a lone cottage. An old woman lives </w:t>
+      </w:r>
+      <w:proofErr w:type="gramStart"/>
+      <w:r>
+        <w:t>there, or</w:t>
+      </w:r>
+      <w:proofErr w:type="gramEnd"/>
+      <w:r>
+        <w:t xml:space="preserve"> did the last time the hours behaved themselves.</w:t>
       </w:r>
       <w:r>
         <w:br/>
@@ -584,13 +600,144 @@
         <w:t>Knight:</w:t>
       </w:r>
     </w:p>
+    <w:p>
+      <w:r>
+        <w:t>K - …</w:t>
+      </w:r>
+    </w:p>
+    <w:p>
+      <w:r>
+        <w:tab/>
+        <w:t xml:space="preserve">P - </w:t>
+      </w:r>
+      <w:r>
+        <w:t>Do you know where the old lady has gone</w:t>
+      </w:r>
+    </w:p>
+    <w:p>
+      <w:r>
+        <w:t xml:space="preserve">K - </w:t>
+      </w:r>
+      <w:r>
+        <w:t>She has gone where the hours no longer trouble her. The cottage is empty because it has served its purpose.</w:t>
+      </w:r>
+      <w:r>
+        <w:br/>
+        <w:t>If you came seeking her words, you are too late. If you came seeking what she kept… then speak plainly, and we will see how much time you truly have.</w:t>
+      </w:r>
+    </w:p>
+    <w:p>
+      <w:r>
+        <w:tab/>
+      </w:r>
+      <w:r>
+        <w:t>P – I need something she owned.</w:t>
+      </w:r>
+    </w:p>
+    <w:p>
+      <w:r>
+        <w:t xml:space="preserve">K - </w:t>
+      </w:r>
+      <w:r>
+        <w:t>Then you are in the right place, and the wrong moment.</w:t>
+      </w:r>
+      <w:r>
+        <w:br/>
+        <w:t>She did not keep many things, but the few she did were guarded with intent. I carry one of them now—not as an heirloom, but as a responsibility.</w:t>
+      </w:r>
+    </w:p>
+    <w:p>
+      <w:r>
+        <w:tab/>
+        <w:t>P – So how would I obtain this responsibility?</w:t>
+      </w:r>
+    </w:p>
+    <w:p>
+      <w:pPr>
+        <w:ind w:left="1440"/>
+      </w:pPr>
+      <w:r>
+        <w:t xml:space="preserve">K - </w:t>
+      </w:r>
+      <w:r>
+        <w:t>By understanding why she kept it, and why I have not destroyed it. The stopwatch does not reveal truth on its own—it confirms it. If you intend to return it to the village, then you will carry it with care, not curiosity. Do that, and I will place it in your hands.</w:t>
+      </w:r>
+    </w:p>
+    <w:p>
+      <w:r>
+        <w:tab/>
+        <w:t>P – Do I need to fight you too.</w:t>
+      </w:r>
+    </w:p>
+    <w:p>
+      <w:pPr>
+        <w:ind w:left="1440"/>
+      </w:pPr>
+      <w:r>
+        <w:t xml:space="preserve">K - </w:t>
+      </w:r>
+      <w:r>
+        <w:t>No. This is not a trial of steel, and I have no interest in adding another grave to the roadside. If you are searching for an enemy, you are early—or late. Either way, not here.</w:t>
+      </w:r>
+    </w:p>
+    <w:p>
+      <w:r>
+        <w:t>P – Why is everyone in this village so reluctant to talk.</w:t>
+      </w:r>
+    </w:p>
+    <w:p>
+      <w:r>
+        <w:t xml:space="preserve">K - </w:t>
+      </w:r>
+      <w:r>
+        <w:t>Because speaking gives shape to things better left without edges. Once named, they demand answers—and answers have a way of claiming people who were merely listening.</w:t>
+      </w:r>
+      <w:r>
+        <w:br/>
+        <w:t>We choose silence not out of fear, but out of practice. It has kept what remains of the village intact… for now.</w:t>
+      </w:r>
+    </w:p>
     <w:p/>
     <w:p>
-      <w:pPr>
-        <w:ind w:left="1440"/>
-      </w:pPr>
-    </w:p>
-    <w:p/>
+      <w:r>
+        <w:lastRenderedPageBreak/>
+        <w:tab/>
+        <w:t xml:space="preserve">P - </w:t>
+      </w:r>
+      <w:r>
+        <w:t>So are you going to give me the watch or not?</w:t>
+      </w:r>
+    </w:p>
+    <w:p>
+      <w:r>
+        <w:t xml:space="preserve">K - </w:t>
+      </w:r>
+      <w:r>
+        <w:t>Yes.</w:t>
+      </w:r>
+      <w:r>
+        <w:t xml:space="preserve"> </w:t>
+      </w:r>
+      <w:r>
+        <w:t>Return it to the chief, and do not ask him what it proves unless you are prepared to learn what has already been lost.</w:t>
+      </w:r>
+    </w:p>
+    <w:p>
+      <w:pPr>
+        <w:pBdr>
+          <w:bottom w:val="single" w:sz="12" w:space="1" w:color="auto"/>
+        </w:pBdr>
+      </w:pPr>
+      <w:r>
+        <w:tab/>
+        <w:t>END</w:t>
+      </w:r>
+    </w:p>
+    <w:p>
+      <w:r>
+        <w:t>The Elder:</w:t>
+      </w:r>
+    </w:p>
     <w:p/>
     <w:sectPr>
       <w:pgSz w:w="11906" w:h="16838"/>

</xml_diff>

<commit_message>
GAI dialogue quest fin
</commit_message>
<xml_diff>
--- a/GAI Dialogue.docx
+++ b/GAI Dialogue.docx
@@ -737,6 +737,285 @@
       <w:r>
         <w:t>The Elder:</w:t>
       </w:r>
+    </w:p>
+    <w:p>
+      <w:r>
+        <w:t xml:space="preserve">E - </w:t>
+      </w:r>
+      <w:r>
+        <w:t>You have returned sooner than I expected… or later than I feared.</w:t>
+      </w:r>
+      <w:r>
+        <w:br/>
+        <w:t>Tell me—do you have the stopwatch?</w:t>
+      </w:r>
+    </w:p>
+    <w:p>
+      <w:r>
+        <w:tab/>
+        <w:t>P – It wasn’t as easy as asking an old lady for it.</w:t>
+      </w:r>
+    </w:p>
+    <w:p>
+      <w:pPr>
+        <w:ind w:left="1440"/>
+      </w:pPr>
+      <w:r>
+        <w:t xml:space="preserve">E - </w:t>
+      </w:r>
+      <w:r>
+        <w:t>So… she did not greet you herself.</w:t>
+      </w:r>
+      <w:r>
+        <w:br/>
+        <w:t>Then tell me—who stood in her stead? The watch does not change hands without reason, and I would very much like to know whose time it is answering to now.</w:t>
+      </w:r>
+    </w:p>
+    <w:p>
+      <w:r>
+        <w:tab/>
+      </w:r>
+      <w:r>
+        <w:tab/>
+      </w:r>
+      <w:r>
+        <w:tab/>
+        <w:t>P – A fancy looking knight had it.</w:t>
+      </w:r>
+    </w:p>
+    <w:p>
+      <w:pPr>
+        <w:ind w:left="1440"/>
+      </w:pPr>
+      <w:r>
+        <w:t xml:space="preserve">E - </w:t>
+      </w:r>
+      <w:r>
+        <w:t>Ah. Then her sense of caution endured longer than her breath.</w:t>
+      </w:r>
+      <w:r>
+        <w:br/>
+        <w:t>A knight, you say… clad in polish rather than necessity? That narrows it more than you might think.</w:t>
+      </w:r>
+    </w:p>
+    <w:p>
+      <w:pPr>
+        <w:ind w:left="1440"/>
+      </w:pPr>
+      <w:r>
+        <w:tab/>
+        <w:t>P – So what happened to the old lady.</w:t>
+      </w:r>
+    </w:p>
+    <w:p>
+      <w:pPr>
+        <w:ind w:left="1440"/>
+      </w:pPr>
+      <w:r>
+        <w:t xml:space="preserve">E - </w:t>
+      </w:r>
+      <w:r>
+        <w:t xml:space="preserve">She stayed longer than most. Someone had to keep the clocks honest while the rest of us learned how to leave without being noticed. When a village is ordered to look alive, it must first learn how to </w:t>
+      </w:r>
+      <w:r>
+        <w:rPr>
+          <w:i/>
+          <w:iCs/>
+        </w:rPr>
+        <w:t>pretend</w:t>
+      </w:r>
+      <w:r>
+        <w:t>.</w:t>
+      </w:r>
+    </w:p>
+    <w:p>
+      <w:pPr>
+        <w:ind w:left="1440"/>
+      </w:pPr>
+      <w:r>
+        <w:tab/>
+        <w:t>P – I don’t understand, what happened?</w:t>
+      </w:r>
+    </w:p>
+    <w:p>
+      <w:pPr>
+        <w:ind w:left="1440"/>
+      </w:pPr>
+      <w:r>
+        <w:tab/>
+        <w:t>P – Can you stop speaking in riddles, old man.</w:t>
+      </w:r>
+    </w:p>
+    <w:p>
+      <w:pPr>
+        <w:ind w:left="1440"/>
+      </w:pPr>
+      <w:r>
+        <w:t xml:space="preserve">E - </w:t>
+      </w:r>
+      <w:r>
+        <w:t xml:space="preserve">We were instructed to keep the streets swept, the homes mended, the fields neat—so our lord might pass through and admire his stewardship. Perfection, he called it. When we failed to meet his standard, he corrected us in the only language he </w:t>
+      </w:r>
+      <w:proofErr w:type="gramStart"/>
+      <w:r>
+        <w:t>knew:</w:t>
+      </w:r>
+      <w:proofErr w:type="gramEnd"/>
+      <w:r>
+        <w:t xml:space="preserve"> heavier taxes, sharper deadlines, fewer excuses.</w:t>
+      </w:r>
+    </w:p>
+    <w:p>
+      <w:pPr>
+        <w:ind w:left="1440"/>
+      </w:pPr>
+      <w:r>
+        <w:tab/>
+        <w:t xml:space="preserve">P - </w:t>
+      </w:r>
+      <w:r>
+        <w:t>…</w:t>
+      </w:r>
+    </w:p>
+    <w:p>
+      <w:pPr>
+        <w:ind w:left="1440"/>
+      </w:pPr>
+      <w:r>
+        <w:t xml:space="preserve">E - </w:t>
+      </w:r>
+      <w:r>
+        <w:t xml:space="preserve">And when even obedience could no longer be afforded, our people were counted not as tenants, but as supplies. Sent away in </w:t>
+      </w:r>
+      <w:r>
+        <w:t>armour</w:t>
+      </w:r>
+      <w:r>
+        <w:t xml:space="preserve"> that did not fit, to die where their absence would be called “service.”</w:t>
+      </w:r>
+      <w:r>
+        <w:br/>
+        <w:t>So I began to measure time differently—how long it took to empty a house, how quietly a family could vanish, how much could be preserved while preparing for the moment when admiration finally arrives… and finds nothing left to praise.</w:t>
+      </w:r>
+    </w:p>
+    <w:p>
+      <w:pPr>
+        <w:ind w:left="1440"/>
+      </w:pPr>
+      <w:r>
+        <w:tab/>
+      </w:r>
+    </w:p>
+    <w:p>
+      <w:pPr>
+        <w:ind w:left="1440"/>
+      </w:pPr>
+    </w:p>
+    <w:p>
+      <w:pPr>
+        <w:ind w:left="1440"/>
+      </w:pPr>
+    </w:p>
+    <w:p>
+      <w:pPr>
+        <w:ind w:left="1440"/>
+      </w:pPr>
+    </w:p>
+    <w:p>
+      <w:pPr>
+        <w:ind w:left="1440" w:firstLine="720"/>
+      </w:pPr>
+      <w:r>
+        <w:lastRenderedPageBreak/>
+        <w:t>P – So what’s left.</w:t>
+      </w:r>
+    </w:p>
+    <w:p>
+      <w:pPr>
+        <w:ind w:left="1440"/>
+      </w:pPr>
+      <w:r>
+        <w:t xml:space="preserve">E - </w:t>
+      </w:r>
+      <w:r>
+        <w:t>What remains is what could not be taken by decree. Stone that still stands, streets that remember footsteps, and one last appointment that has been running late for years.</w:t>
+      </w:r>
+    </w:p>
+    <w:p>
+      <w:pPr>
+        <w:ind w:left="1440"/>
+      </w:pPr>
+      <w:r>
+        <w:t>The people are gone, the village is accounted for, and the stopwatch tells me the moment approaches when cleanliness will no longer matter. When the lord comes to admire what he believes he owns, he will find that even the most carefully kept things are meant to end.</w:t>
+      </w:r>
+    </w:p>
+    <w:p>
+      <w:r>
+        <w:tab/>
+      </w:r>
+      <w:r>
+        <w:tab/>
+      </w:r>
+      <w:r>
+        <w:tab/>
+        <w:t>P – Hey old man, before I leave</w:t>
+      </w:r>
+      <w:r>
+        <w:t>.</w:t>
+      </w:r>
+    </w:p>
+    <w:p>
+      <w:r>
+        <w:tab/>
+      </w:r>
+      <w:r>
+        <w:tab/>
+      </w:r>
+      <w:r>
+        <w:tab/>
+      </w:r>
+      <w:r>
+        <w:tab/>
+        <w:t>P – Who’s time does that watch count down.</w:t>
+      </w:r>
+    </w:p>
+    <w:p>
+      <w:pPr>
+        <w:ind w:left="3600"/>
+      </w:pPr>
+      <w:r>
+        <w:t>Heh. If only time were so courteous as to belong to one man alone.</w:t>
+      </w:r>
+      <w:r>
+        <w:br/>
+        <w:t>Let us say the watch is most attentive when two schedules finally align—one that has been running far too long, and another that arrives precisely when invited.</w:t>
+      </w:r>
+    </w:p>
+    <w:p>
+      <w:pPr>
+        <w:ind w:left="3600"/>
+      </w:pPr>
+      <w:r>
+        <w:t>That is all you need to know. Go now. Some moments are better met without witnesses.</w:t>
+      </w:r>
+    </w:p>
+    <w:p>
+      <w:pPr>
+        <w:ind w:left="3600"/>
+      </w:pPr>
+      <w:r>
+        <w:tab/>
+        <w:t>END</w:t>
+      </w:r>
+    </w:p>
+    <w:p/>
+    <w:p>
+      <w:pPr>
+        <w:pBdr>
+          <w:top w:val="single" w:sz="12" w:space="1" w:color="auto"/>
+          <w:bottom w:val="single" w:sz="12" w:space="1" w:color="auto"/>
+        </w:pBdr>
+      </w:pPr>
     </w:p>
     <w:p/>
     <w:sectPr>

</xml_diff>

<commit_message>
GAI Elder P1 and Knight fin
</commit_message>
<xml_diff>
--- a/GAI Dialogue.docx
+++ b/GAI Dialogue.docx
@@ -39,11 +39,17 @@
         <w:tab/>
         <w:t>P – Why are there so little people?</w:t>
       </w:r>
+      <w:r>
+        <w:t xml:space="preserve"> 1</w:t>
+      </w:r>
     </w:p>
     <w:p>
       <w:r>
         <w:tab/>
         <w:t>P – I noticed that but didn’t want to pry.</w:t>
+      </w:r>
+      <w:r>
+        <w:t xml:space="preserve"> 2</w:t>
       </w:r>
     </w:p>
     <w:p>
@@ -81,6 +87,9 @@
       <w:r>
         <w:t>So would money jog your memory then.</w:t>
       </w:r>
+      <w:r>
+        <w:t xml:space="preserve"> 3</w:t>
+      </w:r>
     </w:p>
     <w:p>
       <w:r>
@@ -92,6 +101,9 @@
       </w:r>
       <w:r>
         <w:t>.</w:t>
+      </w:r>
+      <w:r>
+        <w:t xml:space="preserve"> 4</w:t>
       </w:r>
     </w:p>
     <w:p>
@@ -165,6 +177,9 @@
       <w:r>
         <w:t>Why can’t you do it yourself?</w:t>
       </w:r>
+      <w:r>
+        <w:t xml:space="preserve"> 5</w:t>
+      </w:r>
     </w:p>
     <w:p>
       <w:r>
@@ -174,6 +189,9 @@
       <w:r>
         <w:t>Get someone else to do it.</w:t>
       </w:r>
+      <w:r>
+        <w:t xml:space="preserve"> 6</w:t>
+      </w:r>
     </w:p>
     <w:p>
       <w:r>
@@ -200,6 +218,9 @@
       <w:r>
         <w:t>So you don’t want others to get hurt.</w:t>
       </w:r>
+      <w:r>
+        <w:t xml:space="preserve"> 7</w:t>
+      </w:r>
     </w:p>
     <w:p>
       <w:pPr>
@@ -223,6 +244,9 @@
       <w:r>
         <w:t>Does that have something to do with the request?</w:t>
       </w:r>
+      <w:r>
+        <w:t xml:space="preserve"> 8</w:t>
+      </w:r>
     </w:p>
     <w:p>
       <w:pPr>
@@ -243,6 +267,9 @@
         <w:tab/>
         <w:t>P - I still haven’t said I’m accepting it yet.</w:t>
       </w:r>
+      <w:r>
+        <w:t xml:space="preserve"> 9</w:t>
+      </w:r>
     </w:p>
     <w:p>
       <w:pPr>
@@ -280,6 +307,9 @@
       <w:r>
         <w:t>.</w:t>
       </w:r>
+      <w:r>
+        <w:t xml:space="preserve"> 10</w:t>
+      </w:r>
     </w:p>
     <w:p>
       <w:pPr>
@@ -328,6 +358,9 @@
       <w:r>
         <w:t>.</w:t>
       </w:r>
+      <w:r>
+        <w:t xml:space="preserve"> 11</w:t>
+      </w:r>
     </w:p>
     <w:p>
       <w:pPr>
@@ -361,6 +394,9 @@
       </w:r>
       <w:r>
         <w:t>.</w:t>
+      </w:r>
+      <w:r>
+        <w:t xml:space="preserve"> 12</w:t>
       </w:r>
     </w:p>
     <w:p>
@@ -408,6 +444,9 @@
       <w:r>
         <w:t xml:space="preserve"> U1</w:t>
       </w:r>
+      <w:r>
+        <w:t xml:space="preserve"> 13</w:t>
+      </w:r>
     </w:p>
     <w:p>
       <w:pPr>
@@ -436,6 +475,9 @@
         <w:t>chance?</w:t>
       </w:r>
       <w:proofErr w:type="gramEnd"/>
+      <w:r>
+        <w:t xml:space="preserve"> 14</w:t>
+      </w:r>
     </w:p>
     <w:p>
       <w:pPr>
@@ -473,6 +515,9 @@
       <w:r>
         <w:t>2 "I would to be one of your teachers"</w:t>
       </w:r>
+      <w:r>
+        <w:t xml:space="preserve"> 15</w:t>
+      </w:r>
     </w:p>
     <w:p>
       <w:pPr>
@@ -509,6 +554,9 @@
       <w:r>
         <w:t>.</w:t>
       </w:r>
+      <w:r>
+        <w:t xml:space="preserve"> 16</w:t>
+      </w:r>
     </w:p>
     <w:p>
       <w:pPr>
@@ -562,6 +610,9 @@
       </w:r>
       <w:r>
         <w:t>.</w:t>
+      </w:r>
+      <w:r>
+        <w:t xml:space="preserve"> 17</w:t>
       </w:r>
     </w:p>
     <w:p>

</xml_diff>